<commit_message>
Move misconceptions to internal advisory on Client Advice page
Removed "Misconceptions to Retire" section from both the Ideal
Composite page and the canonical Word doc. Relocated that content
to a new amber advisory card on the Client Advice page, framed as
internal-only awareness for the account team with diplomatic
context about whether/how to surface it with the client. Also
revised email closing from "strong starting point" to something
that better acknowledges the client's effort.

Co-Authored-By: Claude Opus 4.6 <noreply@anthropic.com>
</commit_message>
<xml_diff>
--- a/public/downloads/AI_External_Comms_Guide_Revised.docx
+++ b/public/downloads/AI_External_Comms_Guide_Revised.docx
@@ -2500,109 +2500,6 @@
         </w:rPr>
         <w:pict w14:anchorId="57535367">
           <v:rect id="_x0000_i1029" alt="" style="width:468pt;height:.05pt;mso-width-percent:0;mso-height-percent:0;mso-width-percent:0;mso-height-percent:0" o:hralign="center" o:hrstd="t" o:hr="t"/>
-        </w:pict>
-      </w:r>
-    </w:p>
-    <w:p>
-      <w:pPr>
-        <w:pStyle w:val="Heading2"/>
-      </w:pPr>
-      <w:bookmarkStart w:id="21" w:name="misconceptions-to-retire"/>
-      <w:bookmarkEnd w:id="20"/>
-      <w:r>
-        <w:t>Misconceptions to Retire</w:t>
-      </w:r>
-    </w:p>
-    <w:p>
-      <w:pPr>
-        <w:pStyle w:val="FirstParagraph"/>
-      </w:pPr>
-      <w:r>
-        <w:t>The biggest risk in AI guidance is fake precision. These are the claims the team should stop repeating.</w:t>
-      </w:r>
-    </w:p>
-    <w:p>
-      <w:pPr>
-        <w:pStyle w:val="BodyText"/>
-      </w:pPr>
-      <w:r>
-        <w:rPr>
-          <w:b/>
-          <w:bCs/>
-        </w:rPr>
-        <w:t>“AI assigns discrete classification tags and topic buckets to our content.”</w:t>
-      </w:r>
-      <w:r>
-        <w:t xml:space="preserve"> AI systems can infer likely topic, entity, and document type from a page. But no public documentation from any major platform supports the claim that systems assign fixed hidden labels and sort content into predetermined buckets before anything else happens. Systems work through continuous semantic representations — patterns, not categories.</w:t>
-      </w:r>
-    </w:p>
-    <w:p>
-      <w:pPr>
-        <w:pStyle w:val="BodyText"/>
-      </w:pPr>
-      <w:r>
-        <w:rPr>
-          <w:b/>
-          <w:bCs/>
-        </w:rPr>
-        <w:t>“There is a known percentage uplift from a quote, a metric, or a keyword placement trick.”</w:t>
-      </w:r>
-      <w:r>
-        <w:t xml:space="preserve"> No major platform publishes a universal citation weighting formula, fixed confidence score, or deterministic boost from an FAQ, quote, or bullet list. Use those devices because they help users and improve clarity — not because they are magic switches.</w:t>
-      </w:r>
-    </w:p>
-    <w:p>
-      <w:pPr>
-        <w:pStyle w:val="BodyText"/>
-      </w:pPr>
-      <w:r>
-        <w:rPr>
-          <w:b/>
-          <w:bCs/>
-        </w:rPr>
-        <w:t>“The first 100–200 words determine everything.”</w:t>
-      </w:r>
-      <w:r>
-        <w:t xml:space="preserve"> Front-loading key facts is good practice, but the full page — title, visible headings, metadata, links, internal structure, and accessibility — all matter. Don’t treat the first paragraph as the only one that counts.</w:t>
-      </w:r>
-    </w:p>
-    <w:p>
-      <w:pPr>
-        <w:pStyle w:val="BodyText"/>
-      </w:pPr>
-      <w:r>
-        <w:rPr>
-          <w:b/>
-          <w:bCs/>
-        </w:rPr>
-        <w:t>“Every announcement needs FAQs and summary bullets.”</w:t>
-      </w:r>
-      <w:r>
-        <w:t xml:space="preserve"> Use those elements when they improve clarity and help users. They are optional structures, not mandatory ranking levers.</w:t>
-      </w:r>
-    </w:p>
-    <w:p>
-      <w:pPr>
-        <w:pStyle w:val="BodyText"/>
-      </w:pPr>
-      <w:r>
-        <w:rPr>
-          <w:b/>
-          <w:bCs/>
-        </w:rPr>
-        <w:t>“AI-friendly writing means robotic writing.”</w:t>
-      </w:r>
-      <w:r>
-        <w:t xml:space="preserve"> The goal is clear, human-first writing with explicit facts — not lifeless copy. Everything that makes content good for AI (clarity, specificity, structure, factual precision) also makes it good for journalists and consumers.</w:t>
-      </w:r>
-    </w:p>
-    <w:p>
-      <w:r>
-        <w:rPr>
-          <w:noProof/>
-        </w:rPr>
-        <w:pict w14:anchorId="6FB39117">
-          <v:rect id="_x0000_i1028" alt="" style="width:468pt;height:.05pt;mso-width-percent:0;mso-height-percent:0;mso-width-percent:0;mso-height-percent:0" o:hralign="center" o:hrstd="t" o:hr="t"/>
         </w:pict>
       </w:r>
     </w:p>

</xml_diff>

<commit_message>
Soften email tone, remove measurement section, revise review cadence
- "exactly right" → "spot on"
- "deeper exploration using Fergus" → "ran it through Fergus"
- "examples were particularly strong" → "we particularly liked the examples"
- Remove bullet 4 (measurement/monitoring) from email, Ideal Composite
  page, and downloadable Word doc
- Review cadence now: quarterly or whenever there's a significant shift
  in how models work

Co-Authored-By: Claude Opus 4.6 <noreply@anthropic.com>
</commit_message>
<xml_diff>
--- a/public/downloads/AI_External_Comms_Guide_Revised.docx
+++ b/public/downloads/AI_External_Comms_Guide_Revised.docx
@@ -2292,214 +2292,6 @@
         </w:rPr>
         <w:pict w14:anchorId="748A8A2D">
           <v:rect id="_x0000_i1030" alt="" style="width:468pt;height:.05pt;mso-width-percent:0;mso-height-percent:0;mso-width-percent:0;mso-height-percent:0" o:hralign="center" o:hrstd="t" o:hr="t"/>
-        </w:pict>
-      </w:r>
-    </w:p>
-    <w:p>
-      <w:pPr>
-        <w:pStyle w:val="Heading2"/>
-      </w:pPr>
-      <w:bookmarkStart w:id="20" w:name="measurement-and-monitoring"/>
-      <w:bookmarkEnd w:id="19"/>
-      <w:r>
-        <w:t>Measurement and Monitoring</w:t>
-      </w:r>
-    </w:p>
-    <w:p>
-      <w:pPr>
-        <w:pStyle w:val="FirstParagraph"/>
-      </w:pPr>
-      <w:r>
-        <w:t>The right question is not simply whether an announcement got a click. In AI-assisted search, the better question is whether the official source was findable, cited accurately, and useful when users chose to go deeper.</w:t>
-      </w:r>
-    </w:p>
-    <w:p>
-      <w:pPr>
-        <w:pStyle w:val="BodyText"/>
-      </w:pPr>
-      <w:r>
-        <w:rPr>
-          <w:b/>
-          <w:bCs/>
-        </w:rPr>
-        <w:t>What to monitor:</w:t>
-      </w:r>
-    </w:p>
-    <w:p>
-      <w:pPr>
-        <w:pStyle w:val="Compact"/>
-        <w:numPr>
-          <w:ilvl w:val="0"/>
-          <w:numId w:val="19"/>
-        </w:numPr>
-      </w:pPr>
-      <w:r>
-        <w:t>Search Console performance for newsroom and announcement URLs, including impressions, clicks, and top queries.</w:t>
-      </w:r>
-    </w:p>
-    <w:p>
-      <w:pPr>
-        <w:pStyle w:val="Compact"/>
-        <w:numPr>
-          <w:ilvl w:val="0"/>
-          <w:numId w:val="19"/>
-        </w:numPr>
-      </w:pPr>
-      <w:r>
-        <w:t>Whether branded and non-branded queries land on the intended authoritative page.</w:t>
-      </w:r>
-    </w:p>
-    <w:p>
-      <w:pPr>
-        <w:pStyle w:val="Compact"/>
-        <w:numPr>
-          <w:ilvl w:val="0"/>
-          <w:numId w:val="19"/>
-        </w:numPr>
-      </w:pPr>
-      <w:r>
-        <w:t>Referral traffic and downstream behavior after the click: product-detail continuation, store-locator use, sign-ups, or other conversion events.</w:t>
-      </w:r>
-    </w:p>
-    <w:p>
-      <w:pPr>
-        <w:pStyle w:val="Compact"/>
-        <w:numPr>
-          <w:ilvl w:val="0"/>
-          <w:numId w:val="19"/>
-        </w:numPr>
-      </w:pPr>
-      <w:r>
-        <w:t>Whether common AI assistants answer core questions with the correct date, scope, channels, and product or program name.</w:t>
-      </w:r>
-    </w:p>
-    <w:p>
-      <w:pPr>
-        <w:pStyle w:val="FirstParagraph"/>
-      </w:pPr>
-      <w:r>
-        <w:rPr>
-          <w:b/>
-          <w:bCs/>
-        </w:rPr>
-        <w:t>Platform-specific notes:</w:t>
-      </w:r>
-    </w:p>
-    <w:p>
-      <w:pPr>
-        <w:pStyle w:val="Compact"/>
-        <w:numPr>
-          <w:ilvl w:val="0"/>
-          <w:numId w:val="20"/>
-        </w:numPr>
-      </w:pPr>
-      <w:r>
-        <w:rPr>
-          <w:b/>
-          <w:bCs/>
-        </w:rPr>
-        <w:t>Google:</w:t>
-      </w:r>
-      <w:r>
-        <w:t xml:space="preserve"> AI Overview links count inside ordinary Search Console performance reporting. Track page-level and query-level performance of the URLs you want cited.</w:t>
-      </w:r>
-    </w:p>
-    <w:p>
-      <w:pPr>
-        <w:pStyle w:val="Compact"/>
-        <w:numPr>
-          <w:ilvl w:val="0"/>
-          <w:numId w:val="20"/>
-        </w:numPr>
-      </w:pPr>
-      <w:r>
-        <w:rPr>
-          <w:b/>
-          <w:bCs/>
-        </w:rPr>
-        <w:t>ChatGPT:</w:t>
-      </w:r>
-      <w:r>
-        <w:t xml:space="preserve"> If OAI-SearchBot is allowed and your pages are surfaced, referral URLs include utm_source=chatgpt.com, which makes analytics tracking straightforward.</w:t>
-      </w:r>
-    </w:p>
-    <w:p>
-      <w:pPr>
-        <w:pStyle w:val="FirstParagraph"/>
-      </w:pPr>
-      <w:r>
-        <w:rPr>
-          <w:b/>
-          <w:bCs/>
-        </w:rPr>
-        <w:t>Operating rhythm:</w:t>
-      </w:r>
-    </w:p>
-    <w:p>
-      <w:pPr>
-        <w:pStyle w:val="Compact"/>
-        <w:numPr>
-          <w:ilvl w:val="0"/>
-          <w:numId w:val="21"/>
-        </w:numPr>
-      </w:pPr>
-      <w:r>
-        <w:rPr>
-          <w:b/>
-          <w:bCs/>
-        </w:rPr>
-        <w:t>At publish:</w:t>
-      </w:r>
-      <w:r>
-        <w:t xml:space="preserve"> Inspect the live page (not the CMS preview). Confirm title, date, canonical URL, internal links, and structured data.</w:t>
-      </w:r>
-    </w:p>
-    <w:p>
-      <w:pPr>
-        <w:pStyle w:val="Compact"/>
-        <w:numPr>
-          <w:ilvl w:val="0"/>
-          <w:numId w:val="21"/>
-        </w:numPr>
-      </w:pPr>
-      <w:r>
-        <w:rPr>
-          <w:b/>
-          <w:bCs/>
-        </w:rPr>
-        <w:t>Monthly:</w:t>
-      </w:r>
-      <w:r>
-        <w:t xml:space="preserve"> Run a small set of brand, offer, service, and policy questions in major AI assistants. Note which pages are cited and whether the answers are accurate.</w:t>
-      </w:r>
-    </w:p>
-    <w:p>
-      <w:pPr>
-        <w:pStyle w:val="Compact"/>
-        <w:numPr>
-          <w:ilvl w:val="0"/>
-          <w:numId w:val="21"/>
-        </w:numPr>
-      </w:pPr>
-      <w:r>
-        <w:rPr>
-          <w:b/>
-          <w:bCs/>
-        </w:rPr>
-        <w:lastRenderedPageBreak/>
-        <w:t>Quarterly:</w:t>
-      </w:r>
-      <w:r>
-        <w:t xml:space="preserve"> Audit evergreen top pages, recurring seasonal pages, boilerplate language, About pages, and organization data for staleness.</w:t>
-      </w:r>
-    </w:p>
-    <w:p>
-      <w:r>
-        <w:rPr>
-          <w:noProof/>
-        </w:rPr>
-        <w:pict w14:anchorId="57535367">
-          <v:rect id="_x0000_i1029" alt="" style="width:468pt;height:.05pt;mso-width-percent:0;mso-height-percent:0;mso-width-percent:0;mso-height-percent:0" o:hralign="center" o:hrstd="t" o:hr="t"/>
         </w:pict>
       </w:r>
     </w:p>

</xml_diff>